<commit_message>
Adding instructor support and activity editing
</commit_message>
<xml_diff>
--- a/includes/docgen/templates/roster_template.docx
+++ b/includes/docgen/templates/roster_template.docx
@@ -58,7 +58,7 @@
       <w:tr>
         <w:trPr>
           <w:cantSplit w:val="0"/>
-          <w:trHeight w:val="576" w:hRule="atLeast"/>
+          <w:trHeight w:val="431.99999999999994" w:hRule="atLeast"/>
           <w:tblHeader w:val="0"/>
         </w:trPr>
         <w:tc>
@@ -79,8 +79,8 @@
                 <w:rFonts w:ascii="Arial" w:cs="Arial" w:eastAsia="Arial" w:hAnsi="Arial"/>
                 <w:b w:val="1"/>
                 <w:bCs w:val="1"/>
-                <w:sz w:val="36"/>
-                <w:szCs w:val="36"/>
+                <w:sz w:val="28"/>
+                <w:szCs w:val="28"/>
               </w:rPr>
             </w:pPr>
             <w:r>
@@ -88,8 +88,8 @@
                 <w:rFonts w:ascii="Arial" w:cs="Arial" w:eastAsia="Arial" w:hAnsi="Arial"/>
                 <w:b w:val="1"/>
                 <w:bCs w:val="1"/>
-                <w:sz w:val="36"/>
-                <w:szCs w:val="36"/>
+                <w:sz w:val="28"/>
+                <w:szCs w:val="28"/>
                 <w:rtl w:val="0"/>
               </w:rPr>
               <w:t xml:space="preserve">${session_title}</w:t>
@@ -120,6 +120,8 @@
                 <w:rFonts w:ascii="Arial" w:cs="Arial" w:eastAsia="Arial" w:hAnsi="Arial"/>
                 <w:b w:val="1"/>
                 <w:bCs w:val="1"/>
+                <w:sz w:val="22"/>
+                <w:szCs w:val="22"/>
               </w:rPr>
             </w:pPr>
             <w:r>
@@ -127,9 +129,65 @@
                 <w:rFonts w:ascii="Arial" w:cs="Arial" w:eastAsia="Arial" w:hAnsi="Arial"/>
                 <w:b w:val="1"/>
                 <w:bCs w:val="1"/>
+                <w:sz w:val="22"/>
+                <w:szCs w:val="22"/>
                 <w:rtl w:val="0"/>
               </w:rPr>
               <w:t xml:space="preserve">Clinic: ${dow} ${stime} - ${etime}</w:t>
+            </w:r>
+          </w:p>
+          <w:p>
+            <w:pPr>
+              <w:spacing w:after="0" w:before="0" w:lineRule="auto"/>
+              <w:rPr>
+                <w:b w:val="1"/>
+                <w:bCs w:val="1"/>
+                <w:i w:val="1"/>
+                <w:iCs w:val="1"/>
+                <w:sz w:val="18"/>
+                <w:szCs w:val="18"/>
+              </w:rPr>
+            </w:pPr>
+            <w:r>
+              <w:rPr>
+                <w:b w:val="1"/>
+                <w:bCs w:val="1"/>
+                <w:i w:val="1"/>
+                <w:iCs w:val="1"/>
+                <w:sz w:val="18"/>
+                <w:szCs w:val="18"/>
+                <w:rtl w:val="0"/>
+              </w:rPr>
+              <w:t xml:space="preserve">Instructor(s): ${insts}</w:t>
+            </w:r>
+          </w:p>
+          <w:p>
+            <w:pPr>
+              <w:spacing w:after="0" w:before="0" w:lineRule="auto"/>
+              <w:jc w:val="left"/>
+              <w:rPr>
+                <w:b w:val="1"/>
+                <w:bCs w:val="1"/>
+                <w:i w:val="1"/>
+                <w:iCs w:val="1"/>
+                <w:sz w:val="18"/>
+                <w:szCs w:val="18"/>
+              </w:rPr>
+            </w:pPr>
+            <w:r>
+              <w:rPr>
+                <w:i w:val="1"/>
+                <w:iCs w:val="1"/>
+                <w:sz w:val="18"/>
+                <w:szCs w:val="18"/>
+                <w:rtl w:val="0"/>
+              </w:rPr>
+              <w:t xml:space="preserve">${skipped_clinics}</w:t>
+            </w:r>
+            <w:r>
+              <w:rPr>
+                <w:rtl w:val="0"/>
+              </w:rPr>
             </w:r>
           </w:p>
         </w:tc>
@@ -312,49 +370,6 @@
                 <w:rtl w:val="0"/>
               </w:rPr>
               <w:t xml:space="preserve">${cap}</w:t>
-            </w:r>
-          </w:p>
-        </w:tc>
-      </w:tr>
-      <w:tr>
-        <w:trPr>
-          <w:cantSplit w:val="0"/>
-          <w:trHeight w:val="300" w:hRule="atLeast"/>
-          <w:tblHeader w:val="0"/>
-        </w:trPr>
-        <w:tc>
-          <w:tcPr>
-            <w:gridSpan w:val="5"/>
-            <w:tcBorders>
-              <w:top w:color="000000" w:space="0" w:sz="0" w:val="nil"/>
-              <w:left w:color="000000" w:space="0" w:sz="0" w:val="nil"/>
-              <w:bottom w:color="000000" w:space="0" w:sz="0" w:val="nil"/>
-              <w:right w:color="000000" w:space="0" w:sz="0" w:val="nil"/>
-            </w:tcBorders>
-          </w:tcPr>
-          <w:p>
-            <w:pPr>
-              <w:spacing w:after="120" w:before="120" w:lineRule="auto"/>
-              <w:rPr>
-                <w:b w:val="1"/>
-                <w:bCs w:val="1"/>
-                <w:i w:val="1"/>
-                <w:iCs w:val="1"/>
-                <w:sz w:val="22"/>
-                <w:szCs w:val="22"/>
-              </w:rPr>
-            </w:pPr>
-            <w:r>
-              <w:rPr>
-                <w:b w:val="1"/>
-                <w:bCs w:val="1"/>
-                <w:i w:val="1"/>
-                <w:iCs w:val="1"/>
-                <w:sz w:val="22"/>
-                <w:szCs w:val="22"/>
-                <w:rtl w:val="0"/>
-              </w:rPr>
-              <w:t xml:space="preserve">Instructor(s): ${insts}</w:t>
             </w:r>
           </w:p>
         </w:tc>
@@ -868,46 +883,6 @@
       <w:tr>
         <w:trPr>
           <w:cantSplit w:val="0"/>
-          <w:trHeight w:val="300" w:hRule="atLeast"/>
-          <w:tblHeader w:val="0"/>
-        </w:trPr>
-        <w:tc>
-          <w:tcPr>
-            <w:gridSpan w:val="5"/>
-            <w:tcBorders>
-              <w:top w:color="000000" w:space="0" w:sz="0" w:val="nil"/>
-              <w:left w:color="000000" w:space="0" w:sz="0" w:val="nil"/>
-              <w:bottom w:color="000000" w:space="0" w:sz="0" w:val="nil"/>
-              <w:right w:color="000000" w:space="0" w:sz="0" w:val="nil"/>
-            </w:tcBorders>
-          </w:tcPr>
-          <w:p>
-            <w:pPr>
-              <w:spacing w:after="120" w:before="120" w:lineRule="auto"/>
-              <w:jc w:val="center"/>
-              <w:rPr>
-                <w:i w:val="1"/>
-                <w:iCs w:val="1"/>
-                <w:sz w:val="20"/>
-                <w:szCs w:val="20"/>
-              </w:rPr>
-            </w:pPr>
-            <w:r>
-              <w:rPr>
-                <w:i w:val="1"/>
-                <w:iCs w:val="1"/>
-                <w:sz w:val="20"/>
-                <w:szCs w:val="20"/>
-                <w:rtl w:val="0"/>
-              </w:rPr>
-              <w:t xml:space="preserve">${skipped_clinics}</w:t>
-            </w:r>
-          </w:p>
-        </w:tc>
-      </w:tr>
-      <w:tr>
-        <w:trPr>
-          <w:cantSplit w:val="0"/>
           <w:trHeight w:val="2547" w:hRule="atLeast"/>
           <w:tblHeader w:val="0"/>
         </w:trPr>
@@ -945,7 +920,7 @@
           <w:sdt>
             <w:sdtPr>
               <w:lock w:val="contentLocked"/>
-              <w:id w:val="484440262"/>
+              <w:id w:val="880566376"/>
               <w:tag w:val="goog_rdk_0"/>
             </w:sdtPr>
             <w:sdtContent>

</xml_diff>